<commit_message>
CV: page-break NestiFly onto page 2 in full + Thai variants
Adds an explicit page break before the NestiFly entry (PDF + DOCX, full/Thai only) so the header stays with its bullets at the top of page 2 instead of dangling at the bottom of page 1. 1-page variant unchanged.

Co-Authored-By: Claude Opus 4.8 (1M context) <noreply@anthropic.com>
</commit_message>
<xml_diff>
--- a/ψ/writing/resume/dist/Ittipol_Vongapai_CV.docx
+++ b/ψ/writing/resume/dist/Ittipol_Vongapai_CV.docx
@@ -307,6 +307,11 @@
       </w:pPr>
       <w:r>
         <w:t>Senior frontend on LotteryPlus (lottery web app + back office) — planned a modern React/Next.js architecture (shadcn/ui, Tailwind, React Query, Zod), built a reusable component system, and drove code quality through reviews in Agile delivery.</w:t>
+      </w:r>
+    </w:p>
+    <w:p>
+      <w:r>
+        <w:br w:type="page"/>
       </w:r>
     </w:p>
     <w:p>

</xml_diff>